<commit_message>
DOCX: Updated reference.docx x2
</commit_message>
<xml_diff>
--- a/docs/reference.docx
+++ b/docs/reference.docx
@@ -41,58 +41,58 @@
       <w:r>
         <w:t>Abstract</w:t>
       </w:r>
-      <w:bookmarkStart w:id="0" w:name="_GoBack"/>
-      <w:bookmarkEnd w:id="0"/>
     </w:p>
     <w:p>
       <w:pPr>
         <w:pStyle w:val="1"/>
       </w:pPr>
-      <w:bookmarkStart w:id="1" w:name="heading-1"/>
+      <w:bookmarkStart w:id="0" w:name="heading-1"/>
       <w:r>
         <w:lastRenderedPageBreak/>
         <w:t>Heading 1</w:t>
       </w:r>
+      <w:bookmarkEnd w:id="0"/>
+    </w:p>
+    <w:p>
+      <w:pPr>
+        <w:pStyle w:val="2"/>
+      </w:pPr>
+      <w:bookmarkStart w:id="1" w:name="heading-2"/>
+      <w:r>
+        <w:t>Heading 2</w:t>
+      </w:r>
       <w:bookmarkEnd w:id="1"/>
     </w:p>
     <w:p>
       <w:pPr>
-        <w:pStyle w:val="2"/>
-      </w:pPr>
-      <w:bookmarkStart w:id="2" w:name="heading-2"/>
-      <w:r>
-        <w:t>Heading 2</w:t>
+        <w:pStyle w:val="3"/>
+      </w:pPr>
+      <w:bookmarkStart w:id="2" w:name="heading-3"/>
+      <w:r>
+        <w:t>Heading 3</w:t>
       </w:r>
       <w:bookmarkEnd w:id="2"/>
     </w:p>
     <w:p>
       <w:pPr>
-        <w:pStyle w:val="3"/>
-      </w:pPr>
-      <w:bookmarkStart w:id="3" w:name="heading-3"/>
-      <w:r>
-        <w:t>Heading 3</w:t>
+        <w:pStyle w:val="4"/>
+      </w:pPr>
+      <w:bookmarkStart w:id="3" w:name="heading-4"/>
+      <w:r>
+        <w:t>Heading 4</w:t>
       </w:r>
       <w:bookmarkEnd w:id="3"/>
     </w:p>
     <w:p>
       <w:pPr>
-        <w:pStyle w:val="4"/>
-      </w:pPr>
-      <w:bookmarkStart w:id="4" w:name="heading-4"/>
-      <w:r>
-        <w:t>Heading 4</w:t>
-      </w:r>
+        <w:pStyle w:val="5"/>
+      </w:pPr>
+      <w:bookmarkStart w:id="4" w:name="heading-5"/>
+      <w:r>
+        <w:t>Heading 5</w:t>
+      </w:r>
+      <w:bookmarkStart w:id="5" w:name="_GoBack"/>
       <w:bookmarkEnd w:id="4"/>
-    </w:p>
-    <w:p>
-      <w:pPr>
-        <w:pStyle w:val="5"/>
-      </w:pPr>
-      <w:bookmarkStart w:id="5" w:name="heading-5"/>
-      <w:r>
-        <w:t>Heading 5</w:t>
-      </w:r>
       <w:bookmarkEnd w:id="5"/>
     </w:p>
     <w:p>
@@ -446,7 +446,7 @@
   <w:abstractNum w:abstractNumId="0" w15:restartNumberingAfterBreak="0">
     <w:nsid w:val="FFFFFF7C"/>
     <w:multiLevelType w:val="singleLevel"/>
-    <w:tmpl w:val="27241C28"/>
+    <w:tmpl w:val="0ECE60CC"/>
     <w:lvl w:ilvl="0">
       <w:start w:val="1"/>
       <w:numFmt w:val="decimal"/>
@@ -463,7 +463,7 @@
   <w:abstractNum w:abstractNumId="1" w15:restartNumberingAfterBreak="0">
     <w:nsid w:val="FFFFFF7D"/>
     <w:multiLevelType w:val="singleLevel"/>
-    <w:tmpl w:val="940E4A34"/>
+    <w:tmpl w:val="A7A02F1E"/>
     <w:lvl w:ilvl="0">
       <w:start w:val="1"/>
       <w:numFmt w:val="decimal"/>
@@ -480,7 +480,7 @@
   <w:abstractNum w:abstractNumId="2" w15:restartNumberingAfterBreak="0">
     <w:nsid w:val="FFFFFF7E"/>
     <w:multiLevelType w:val="singleLevel"/>
-    <w:tmpl w:val="6912444C"/>
+    <w:tmpl w:val="F4B801A6"/>
     <w:lvl w:ilvl="0">
       <w:start w:val="1"/>
       <w:numFmt w:val="decimal"/>
@@ -497,7 +497,7 @@
   <w:abstractNum w:abstractNumId="3" w15:restartNumberingAfterBreak="0">
     <w:nsid w:val="FFFFFF7F"/>
     <w:multiLevelType w:val="singleLevel"/>
-    <w:tmpl w:val="B928D00E"/>
+    <w:tmpl w:val="8A0A23A4"/>
     <w:lvl w:ilvl="0">
       <w:start w:val="1"/>
       <w:numFmt w:val="decimal"/>
@@ -514,7 +514,7 @@
   <w:abstractNum w:abstractNumId="4" w15:restartNumberingAfterBreak="0">
     <w:nsid w:val="FFFFFF80"/>
     <w:multiLevelType w:val="singleLevel"/>
-    <w:tmpl w:val="66E4AE1E"/>
+    <w:tmpl w:val="26444E06"/>
     <w:lvl w:ilvl="0">
       <w:start w:val="1"/>
       <w:numFmt w:val="bullet"/>
@@ -534,7 +534,7 @@
   <w:abstractNum w:abstractNumId="5" w15:restartNumberingAfterBreak="0">
     <w:nsid w:val="FFFFFF81"/>
     <w:multiLevelType w:val="singleLevel"/>
-    <w:tmpl w:val="7068D560"/>
+    <w:tmpl w:val="48FECC0E"/>
     <w:lvl w:ilvl="0">
       <w:start w:val="1"/>
       <w:numFmt w:val="bullet"/>
@@ -554,7 +554,7 @@
   <w:abstractNum w:abstractNumId="6" w15:restartNumberingAfterBreak="0">
     <w:nsid w:val="FFFFFF82"/>
     <w:multiLevelType w:val="singleLevel"/>
-    <w:tmpl w:val="10DC3B96"/>
+    <w:tmpl w:val="6DA254F4"/>
     <w:lvl w:ilvl="0">
       <w:start w:val="1"/>
       <w:numFmt w:val="bullet"/>
@@ -574,7 +574,7 @@
   <w:abstractNum w:abstractNumId="7" w15:restartNumberingAfterBreak="0">
     <w:nsid w:val="FFFFFF83"/>
     <w:multiLevelType w:val="singleLevel"/>
-    <w:tmpl w:val="82C4041C"/>
+    <w:tmpl w:val="A6B4F6CE"/>
     <w:lvl w:ilvl="0">
       <w:start w:val="1"/>
       <w:numFmt w:val="bullet"/>
@@ -594,7 +594,7 @@
   <w:abstractNum w:abstractNumId="8" w15:restartNumberingAfterBreak="0">
     <w:nsid w:val="FFFFFF88"/>
     <w:multiLevelType w:val="singleLevel"/>
-    <w:tmpl w:val="5B70460C"/>
+    <w:tmpl w:val="A546DDC8"/>
     <w:lvl w:ilvl="0">
       <w:start w:val="1"/>
       <w:numFmt w:val="decimal"/>
@@ -611,7 +611,7 @@
   <w:abstractNum w:abstractNumId="9" w15:restartNumberingAfterBreak="0">
     <w:nsid w:val="FFFFFF89"/>
     <w:multiLevelType w:val="singleLevel"/>
-    <w:tmpl w:val="10C4B692"/>
+    <w:tmpl w:val="24DEB558"/>
     <w:lvl w:ilvl="0">
       <w:start w:val="1"/>
       <w:numFmt w:val="bullet"/>
@@ -1633,12 +1633,12 @@
     <w:uiPriority w:val="9"/>
     <w:unhideWhenUsed/>
     <w:qFormat/>
-    <w:rsid w:val="00593C68"/>
+    <w:rsid w:val="00B16BB8"/>
     <w:pPr>
       <w:pBdr>
         <w:left w:val="single" w:sz="48" w:space="4" w:color="0E2841" w:themeColor="text2"/>
       </w:pBdr>
-      <w:shd w:val="solid" w:color="DAE9F7" w:themeColor="text2" w:themeTint="1A" w:fill="auto"/>
+      <w:shd w:val="solid" w:color="EBF3FB" w:fill="auto"/>
       <w:spacing w:before="120" w:after="120"/>
       <w:ind w:left="482" w:right="482"/>
     </w:pPr>
@@ -1853,6 +1853,22 @@
     <w:rsid w:val="00F04BFD"/>
     <w:rPr>
       <w:rFonts w:ascii="Times New Roman" w:hAnsi="Times New Roman"/>
+    </w:rPr>
+  </w:style>
+  <w:style w:type="character" w:styleId="HTML">
+    <w:name w:val="HTML Code"/>
+    <w:aliases w:val="Source Code"/>
+    <w:basedOn w:val="a1"/>
+    <w:semiHidden/>
+    <w:unhideWhenUsed/>
+    <w:rsid w:val="00B16BB8"/>
+    <w:rPr>
+      <w:rFonts w:ascii="Consolas" w:hAnsi="Consolas"/>
+      <w:color w:val="80340D" w:themeColor="accent2" w:themeShade="80"/>
+      <w:sz w:val="20"/>
+      <w:szCs w:val="20"/>
+      <w:bdr w:val="none" w:sz="0" w:space="0" w:color="auto"/>
+      <w:shd w:val="solid" w:color="FFEDB3" w:fill="auto"/>
     </w:rPr>
   </w:style>
 </w:styles>

</xml_diff>

<commit_message>
DOCX: Updated reference.docx x3
</commit_message>
<xml_diff>
--- a/docs/reference.docx
+++ b/docs/reference.docx
@@ -91,49 +91,47 @@
       <w:r>
         <w:t>Heading 5</w:t>
       </w:r>
-      <w:bookmarkStart w:id="5" w:name="_GoBack"/>
       <w:bookmarkEnd w:id="4"/>
+    </w:p>
+    <w:p>
+      <w:pPr>
+        <w:pStyle w:val="6"/>
+      </w:pPr>
+      <w:bookmarkStart w:id="5" w:name="heading-6"/>
+      <w:r>
+        <w:t>Heading 6</w:t>
+      </w:r>
       <w:bookmarkEnd w:id="5"/>
     </w:p>
     <w:p>
       <w:pPr>
-        <w:pStyle w:val="6"/>
-      </w:pPr>
-      <w:bookmarkStart w:id="6" w:name="heading-6"/>
-      <w:r>
-        <w:t>Heading 6</w:t>
+        <w:pStyle w:val="7"/>
+      </w:pPr>
+      <w:bookmarkStart w:id="6" w:name="heading-7"/>
+      <w:r>
+        <w:t>Heading 7</w:t>
       </w:r>
       <w:bookmarkEnd w:id="6"/>
     </w:p>
     <w:p>
       <w:pPr>
-        <w:pStyle w:val="7"/>
-      </w:pPr>
-      <w:bookmarkStart w:id="7" w:name="heading-7"/>
-      <w:r>
-        <w:t>Heading 7</w:t>
+        <w:pStyle w:val="8"/>
+      </w:pPr>
+      <w:bookmarkStart w:id="7" w:name="heading-8"/>
+      <w:r>
+        <w:t>Heading 8</w:t>
       </w:r>
       <w:bookmarkEnd w:id="7"/>
     </w:p>
     <w:p>
       <w:pPr>
-        <w:pStyle w:val="8"/>
-      </w:pPr>
-      <w:bookmarkStart w:id="8" w:name="heading-8"/>
-      <w:r>
-        <w:t>Heading 8</w:t>
+        <w:pStyle w:val="9"/>
+      </w:pPr>
+      <w:bookmarkStart w:id="8" w:name="heading-9"/>
+      <w:r>
+        <w:t>Heading 9</w:t>
       </w:r>
       <w:bookmarkEnd w:id="8"/>
-    </w:p>
-    <w:p>
-      <w:pPr>
-        <w:pStyle w:val="9"/>
-      </w:pPr>
-      <w:bookmarkStart w:id="9" w:name="heading-9"/>
-      <w:r>
-        <w:t>Heading 9</w:t>
-      </w:r>
-      <w:bookmarkEnd w:id="9"/>
     </w:p>
     <w:p>
       <w:pPr>
@@ -289,9 +287,11 @@
       <w:pPr>
         <w:pStyle w:val="DefinitionTerm"/>
       </w:pPr>
+      <w:proofErr w:type="spellStart"/>
       <w:r>
         <w:t>DefinitionTerm</w:t>
       </w:r>
+      <w:proofErr w:type="spellEnd"/>
     </w:p>
     <w:p>
       <w:pPr>
@@ -305,9 +305,11 @@
       <w:pPr>
         <w:pStyle w:val="DefinitionTerm"/>
       </w:pPr>
+      <w:proofErr w:type="spellStart"/>
       <w:r>
         <w:t>DefinitionTerm</w:t>
       </w:r>
+      <w:proofErr w:type="spellEnd"/>
     </w:p>
     <w:p>
       <w:pPr>
@@ -316,6 +318,8 @@
       <w:r>
         <w:t>Definition</w:t>
       </w:r>
+      <w:bookmarkStart w:id="9" w:name="_GoBack"/>
+      <w:bookmarkEnd w:id="9"/>
     </w:p>
     <w:sectPr>
       <w:footerReference w:type="default" r:id="rId8"/>
@@ -387,7 +391,7 @@
             <w:noProof/>
             <w:lang w:val="ru-RU"/>
           </w:rPr>
-          <w:t>1</w:t>
+          <w:t>2</w:t>
         </w:r>
         <w:r>
           <w:fldChar w:fldCharType="end"/>
@@ -446,7 +450,7 @@
   <w:abstractNum w:abstractNumId="0" w15:restartNumberingAfterBreak="0">
     <w:nsid w:val="FFFFFF7C"/>
     <w:multiLevelType w:val="singleLevel"/>
-    <w:tmpl w:val="0ECE60CC"/>
+    <w:tmpl w:val="F416746C"/>
     <w:lvl w:ilvl="0">
       <w:start w:val="1"/>
       <w:numFmt w:val="decimal"/>
@@ -463,7 +467,7 @@
   <w:abstractNum w:abstractNumId="1" w15:restartNumberingAfterBreak="0">
     <w:nsid w:val="FFFFFF7D"/>
     <w:multiLevelType w:val="singleLevel"/>
-    <w:tmpl w:val="A7A02F1E"/>
+    <w:tmpl w:val="E31C3FA2"/>
     <w:lvl w:ilvl="0">
       <w:start w:val="1"/>
       <w:numFmt w:val="decimal"/>
@@ -480,7 +484,7 @@
   <w:abstractNum w:abstractNumId="2" w15:restartNumberingAfterBreak="0">
     <w:nsid w:val="FFFFFF7E"/>
     <w:multiLevelType w:val="singleLevel"/>
-    <w:tmpl w:val="F4B801A6"/>
+    <w:tmpl w:val="367EFC06"/>
     <w:lvl w:ilvl="0">
       <w:start w:val="1"/>
       <w:numFmt w:val="decimal"/>
@@ -497,7 +501,7 @@
   <w:abstractNum w:abstractNumId="3" w15:restartNumberingAfterBreak="0">
     <w:nsid w:val="FFFFFF7F"/>
     <w:multiLevelType w:val="singleLevel"/>
-    <w:tmpl w:val="8A0A23A4"/>
+    <w:tmpl w:val="8E46B146"/>
     <w:lvl w:ilvl="0">
       <w:start w:val="1"/>
       <w:numFmt w:val="decimal"/>
@@ -514,7 +518,7 @@
   <w:abstractNum w:abstractNumId="4" w15:restartNumberingAfterBreak="0">
     <w:nsid w:val="FFFFFF80"/>
     <w:multiLevelType w:val="singleLevel"/>
-    <w:tmpl w:val="26444E06"/>
+    <w:tmpl w:val="745ECFE0"/>
     <w:lvl w:ilvl="0">
       <w:start w:val="1"/>
       <w:numFmt w:val="bullet"/>
@@ -534,7 +538,7 @@
   <w:abstractNum w:abstractNumId="5" w15:restartNumberingAfterBreak="0">
     <w:nsid w:val="FFFFFF81"/>
     <w:multiLevelType w:val="singleLevel"/>
-    <w:tmpl w:val="48FECC0E"/>
+    <w:tmpl w:val="52DA02C0"/>
     <w:lvl w:ilvl="0">
       <w:start w:val="1"/>
       <w:numFmt w:val="bullet"/>
@@ -554,7 +558,7 @@
   <w:abstractNum w:abstractNumId="6" w15:restartNumberingAfterBreak="0">
     <w:nsid w:val="FFFFFF82"/>
     <w:multiLevelType w:val="singleLevel"/>
-    <w:tmpl w:val="6DA254F4"/>
+    <w:tmpl w:val="40F450A6"/>
     <w:lvl w:ilvl="0">
       <w:start w:val="1"/>
       <w:numFmt w:val="bullet"/>
@@ -574,7 +578,7 @@
   <w:abstractNum w:abstractNumId="7" w15:restartNumberingAfterBreak="0">
     <w:nsid w:val="FFFFFF83"/>
     <w:multiLevelType w:val="singleLevel"/>
-    <w:tmpl w:val="A6B4F6CE"/>
+    <w:tmpl w:val="22C2EC6E"/>
     <w:lvl w:ilvl="0">
       <w:start w:val="1"/>
       <w:numFmt w:val="bullet"/>
@@ -594,7 +598,7 @@
   <w:abstractNum w:abstractNumId="8" w15:restartNumberingAfterBreak="0">
     <w:nsid w:val="FFFFFF88"/>
     <w:multiLevelType w:val="singleLevel"/>
-    <w:tmpl w:val="A546DDC8"/>
+    <w:tmpl w:val="3738EAC4"/>
     <w:lvl w:ilvl="0">
       <w:start w:val="1"/>
       <w:numFmt w:val="decimal"/>
@@ -611,7 +615,7 @@
   <w:abstractNum w:abstractNumId="9" w15:restartNumberingAfterBreak="0">
     <w:nsid w:val="FFFFFF89"/>
     <w:multiLevelType w:val="singleLevel"/>
-    <w:tmpl w:val="24DEB558"/>
+    <w:tmpl w:val="F2064F38"/>
     <w:lvl w:ilvl="0">
       <w:start w:val="1"/>
       <w:numFmt w:val="bullet"/>
@@ -1778,10 +1782,10 @@
   <w:style w:type="character" w:styleId="af0">
     <w:name w:val="Hyperlink"/>
     <w:basedOn w:val="ae"/>
-    <w:rsid w:val="004D6D54"/>
-    <w:rPr>
-      <w:i/>
-      <w:color w:val="4C94D8" w:themeColor="text2" w:themeTint="80"/>
+    <w:rsid w:val="0057782C"/>
+    <w:rPr>
+      <w:i w:val="0"/>
+      <w:color w:val="215E99" w:themeColor="text2" w:themeTint="BF"/>
       <w:u w:val="single"/>
     </w:rPr>
   </w:style>
@@ -1857,8 +1861,7 @@
   </w:style>
   <w:style w:type="character" w:styleId="HTML">
     <w:name w:val="HTML Code"/>
-    <w:aliases w:val="Source Code"/>
-    <w:basedOn w:val="a1"/>
+    <w:basedOn w:val="a4"/>
     <w:semiHidden/>
     <w:unhideWhenUsed/>
     <w:rsid w:val="00B16BB8"/>
@@ -1869,6 +1872,38 @@
       <w:szCs w:val="20"/>
       <w:bdr w:val="none" w:sz="0" w:space="0" w:color="auto"/>
       <w:shd w:val="solid" w:color="FFEDB3" w:fill="auto"/>
+    </w:rPr>
+  </w:style>
+  <w:style w:type="paragraph" w:styleId="HTML0">
+    <w:name w:val="HTML Address"/>
+    <w:aliases w:val="Source Code"/>
+    <w:basedOn w:val="a"/>
+    <w:link w:val="HTML1"/>
+    <w:semiHidden/>
+    <w:unhideWhenUsed/>
+    <w:rsid w:val="005C2638"/>
+    <w:pPr>
+      <w:shd w:val="solid" w:color="FAE2D5" w:themeColor="accent2" w:themeTint="33" w:fill="auto"/>
+      <w:spacing w:after="0"/>
+    </w:pPr>
+    <w:rPr>
+      <w:rFonts w:ascii="Consolas" w:hAnsi="Consolas"/>
+      <w:iCs/>
+      <w:color w:val="572309"/>
+    </w:rPr>
+  </w:style>
+  <w:style w:type="character" w:customStyle="1" w:styleId="HTML1">
+    <w:name w:val="Адрес HTML Знак"/>
+    <w:aliases w:val="Source Code Знак"/>
+    <w:basedOn w:val="a1"/>
+    <w:link w:val="HTML0"/>
+    <w:semiHidden/>
+    <w:rsid w:val="005C2638"/>
+    <w:rPr>
+      <w:rFonts w:ascii="Consolas" w:hAnsi="Consolas"/>
+      <w:iCs/>
+      <w:color w:val="572309"/>
+      <w:shd w:val="solid" w:color="FAE2D5" w:themeColor="accent2" w:themeTint="33" w:fill="auto"/>
     </w:rPr>
   </w:style>
 </w:styles>

</xml_diff>